<commit_message>
fix(content): unify poem sign-offs & titles, restore lost incipit lines
</commit_message>
<xml_diff>
--- a/src/content/poetry/01-a-esli-budu-ya-ne-prav/ru.docx
+++ b/src/content/poetry/01-a-esli-budu-ya-ne-prav/ru.docx
@@ -303,16 +303,22 @@
     </w:p>
     <w:p>
       <w:pPr>
-        <w:pStyle w:val="a3"/>
-      </w:pPr>
+        <w:spacing w:before="200"/>
+        <w:rPr>
+          <w:i/>
+          <w:iCs/>
+        </w:rPr>
+      </w:pPr>
+      <w:r>
+        <w:rPr>
+          <w:i/>
+          <w:iCs/>
+        </w:rPr>
+        <w:t xml:space="preserve">24.10.2024, Сергей Панкратиус</w:t>
+      </w:r>
     </w:p>
     <w:bookmarkEnd w:id="0"/>
     <w:bookmarkEnd w:id="1"/>
-    <w:p>
-      <w:pPr>
-        <w:pStyle w:val="a3"/>
-      </w:pPr>
-    </w:p>
     <w:sectPr>
       <w:pgSz w:w="11906" w:h="16838"/>
       <w:pgMar w:top="1134" w:right="850" w:bottom="1134" w:left="1701" w:header="708" w:footer="708" w:gutter="0"/>

</xml_diff>